<commit_message>
auto: session 2026-08-18 10:28
Co-Authored-By: Claude Opus 4.8 (1M context) <noreply@anthropic.com>
</commit_message>
<xml_diff>
--- a/11-bao-gia-khach/Bao-gia-CafeF-CafeBiz-DoanhNhan-LuuNguyenAnhMinh-2026-08-18.docx
+++ b/11-bao-gia-khach/Bao-gia-CafeF-CafeBiz-DoanhNhan-LuuNguyenAnhMinh-2026-08-18.docx
@@ -915,176 +915,7 @@
           </w:p>
         </w:tc>
       </w:tr>
-      <w:tr>
-        <w:tc>
-          <w:tcPr>
-            <w:tcW w:type="dxa" w:w="1814"/>
-            <w:tcMar>
-              <w:top w:type="dxa" w:w="90"/>
-              <w:left w:type="dxa" w:w="90"/>
-              <w:bottom w:type="dxa" w:w="90"/>
-              <w:right w:type="dxa" w:w="90"/>
-            </w:tcMar>
-            <w:vAlign w:val="center"/>
-          </w:tcPr>
-          <w:p>
-            <w:r/>
-            <w:r>
-              <w:rPr>
-                <w:b w:val="0"/>
-                <w:strike w:val="0"/>
-                <w:color w:val="1C2035"/>
-                <w:sz w:val="17"/>
-              </w:rPr>
-              <w:t>Loại 1 Home - Nổi bật - Trang chủ</w:t>
-            </w:r>
-          </w:p>
-        </w:tc>
-        <w:tc>
-          <w:tcPr>
-            <w:tcW w:type="dxa" w:w="2381"/>
-            <w:tcMar>
-              <w:top w:type="dxa" w:w="90"/>
-              <w:left w:type="dxa" w:w="90"/>
-              <w:bottom w:type="dxa" w:w="90"/>
-              <w:right w:type="dxa" w:w="90"/>
-            </w:tcMar>
-            <w:vAlign w:val="center"/>
-          </w:tcPr>
-          <w:p>
-            <w:r/>
-            <w:r>
-              <w:rPr>
-                <w:b w:val="0"/>
-                <w:strike w:val="0"/>
-                <w:color w:val="1C2035"/>
-                <w:sz w:val="17"/>
-              </w:rPr>
-              <w:t>5 hình chất lượng cao, duyệt 1-2 ngày, layout đã xác nhận không huỷ/sửa</w:t>
-            </w:r>
-          </w:p>
-        </w:tc>
-        <w:tc>
-          <w:tcPr>
-            <w:tcW w:type="dxa" w:w="2268"/>
-            <w:tcMar>
-              <w:top w:type="dxa" w:w="90"/>
-              <w:left w:type="dxa" w:w="90"/>
-              <w:bottom w:type="dxa" w:w="90"/>
-              <w:right w:type="dxa" w:w="90"/>
-            </w:tcMar>
-            <w:vAlign w:val="center"/>
-          </w:tcPr>
-          <w:p>
-            <w:r/>
-            <w:r>
-              <w:rPr>
-                <w:b w:val="0"/>
-                <w:strike w:val="0"/>
-                <w:color w:val="1C2035"/>
-                <w:sz w:val="17"/>
-              </w:rPr>
-              <w:t>1 hyperlink</w:t>
-            </w:r>
-          </w:p>
-        </w:tc>
-        <w:tc>
-          <w:tcPr>
-            <w:tcW w:type="dxa" w:w="1247"/>
-            <w:tcMar>
-              <w:top w:type="dxa" w:w="90"/>
-              <w:left w:type="dxa" w:w="90"/>
-              <w:bottom w:type="dxa" w:w="90"/>
-              <w:right w:type="dxa" w:w="90"/>
-            </w:tcMar>
-            <w:vAlign w:val="center"/>
-          </w:tcPr>
-          <w:p>
-            <w:pPr>
-              <w:jc w:val="right"/>
-            </w:pPr>
-            <w:r/>
-            <w:r>
-              <w:rPr>
-                <w:b w:val="0"/>
-                <w:strike/>
-                <w:color w:val="9AA3AF"/>
-                <w:sz w:val="17"/>
-              </w:rPr>
-              <w:t>77.740.000 đ</w:t>
-            </w:r>
-          </w:p>
-        </w:tc>
-        <w:tc>
-          <w:tcPr>
-            <w:tcW w:type="dxa" w:w="680"/>
-            <w:tcMar>
-              <w:top w:type="dxa" w:w="90"/>
-              <w:left w:type="dxa" w:w="90"/>
-              <w:bottom w:type="dxa" w:w="90"/>
-              <w:right w:type="dxa" w:w="90"/>
-            </w:tcMar>
-            <w:vAlign w:val="center"/>
-          </w:tcPr>
-          <w:p>
-            <w:pPr>
-              <w:jc w:val="center"/>
-            </w:pPr>
-            <w:r/>
-            <w:r>
-              <w:rPr>
-                <w:b/>
-                <w:strike w:val="0"/>
-                <w:color w:val="C0553A"/>
-                <w:sz w:val="17"/>
-              </w:rPr>
-              <w:t>-27%</w:t>
-            </w:r>
-          </w:p>
-        </w:tc>
-        <w:tc>
-          <w:tcPr>
-            <w:tcW w:type="dxa" w:w="1247"/>
-            <w:tcMar>
-              <w:top w:type="dxa" w:w="90"/>
-              <w:left w:type="dxa" w:w="90"/>
-              <w:bottom w:type="dxa" w:w="90"/>
-              <w:right w:type="dxa" w:w="90"/>
-            </w:tcMar>
-            <w:vAlign w:val="center"/>
-          </w:tcPr>
-          <w:p>
-            <w:pPr>
-              <w:jc w:val="right"/>
-            </w:pPr>
-            <w:r/>
-            <w:r>
-              <w:rPr>
-                <w:b/>
-                <w:strike w:val="0"/>
-                <w:color w:val="0E8C7F"/>
-                <w:sz w:val="18"/>
-              </w:rPr>
-              <w:t>56.753.000 đ</w:t>
-            </w:r>
-          </w:p>
-        </w:tc>
-      </w:tr>
     </w:tbl>
-    <w:p>
-      <w:pPr>
-        <w:spacing w:before="60" w:after="200"/>
-      </w:pPr>
-      <w:r>
-        <w:rPr>
-          <w:b w:val="0"/>
-          <w:i/>
-          <w:color w:val="5B6675"/>
-          <w:sz w:val="17"/>
-        </w:rPr>
-        <w:t>Vị trí "Loại 1 Home - Nổi bật - Trang chủ" phù hợp chiến dịch ra mắt sản phẩm/thương hiệu cần độ phủ mạnh ngay trang chủ CafeF.</w:t>
-      </w:r>
-    </w:p>
     <w:p>
       <w:pPr>
         <w:spacing w:before="160" w:after="80"/>
@@ -6179,7 +6010,7 @@
           <w:color w:val="1C2035"/>
           <w:sz w:val="19"/>
         </w:rPr>
-        <w:t>Thời gian duyệt bài: 1-3 ngày làm việc tuỳ báo, kể từ khi nhận đủ nội dung và giấy tờ. Riêng vị trí "Loại 1 Home - Nổi bật - Trang chủ" CafeF: layout xác nhận trước khi đăng, không huỷ/sửa sau khi đã duyệt.</w:t>
+        <w:t>Thời gian duyệt bài: 1-3 ngày làm việc tuỳ báo, kể từ khi nhận đủ nội dung và giấy tờ.</w:t>
       </w:r>
     </w:p>
     <w:p>

</xml_diff>